<commit_message>
No QR in CV
</commit_message>
<xml_diff>
--- a/cv/erez-volk-cv-programmer.docx
+++ b/cv/erez-volk-cv-programmer.docx
@@ -47,32 +47,14 @@
     <w:p>
       <w:pPr>
         <w:pStyle w:val="CVHomepage"/>
-        <w:rPr>
-          <w:rStyle w:val="CVHyperlinkQR"/>
-        </w:rPr>
-      </w:pPr>
-      <w:r>
-        <w:rPr>
-          <w:rStyle w:val="CVHyperlinkQR"/>
-        </w:rPr>
-        <w:t>https://</w:t>
-      </w:r>
-      <w:r>
-        <w:rPr>
-          <w:rStyle w:val="CVHyperlinkQR"/>
-        </w:rPr>
+      </w:pPr>
+      <w:r>
         <w:t>www.</w:t>
       </w:r>
       <w:r>
-        <w:rPr>
-          <w:rStyle w:val="CVHyperlinkQR"/>
-        </w:rPr>
         <w:t>linkedin.com/in/erez</w:t>
       </w:r>
       <w:r>
-        <w:rPr>
-          <w:rStyle w:val="CVHyperlinkQR"/>
-        </w:rPr>
         <w:t>v</w:t>
       </w:r>
     </w:p>
@@ -493,8 +475,6 @@
       </w:r>
       <w:r>
         <w:tab/>
-      </w:r>
-      <w:r>
         <w:t>Lecturer</w:t>
       </w:r>
     </w:p>
@@ -625,10 +605,7 @@
         <w:tab/>
       </w:r>
       <w:r>
-        <w:t>Research Assistant</w:t>
-      </w:r>
-      <w:r>
-        <w:t>@</w:t>
+        <w:t>Research Assistant@</w:t>
       </w:r>
       <w:r>
         <w:t>Weizmann Institute</w:t>
@@ -671,30 +648,57 @@
         <w:tab/>
       </w:r>
       <w:r>
+        <w:rPr>
+          <w:lang w:val="fr-FR"/>
+        </w:rPr>
         <w:t>Mata</w:t>
       </w:r>
       <w:r>
+        <w:rPr>
+          <w:lang w:val="fr-FR"/>
+        </w:rPr>
         <w:t>l</w:t>
       </w:r>
       <w:r>
+        <w:rPr>
+          <w:lang w:val="fr-FR"/>
+        </w:rPr>
         <w:t xml:space="preserve">on et al. (2025), </w:t>
       </w:r>
       <w:r>
+        <w:rPr>
+          <w:lang w:val="fr-FR"/>
+        </w:rPr>
         <w:t>"</w:t>
       </w:r>
       <w:r>
+        <w:rPr>
+          <w:lang w:val="fr-FR"/>
+        </w:rPr>
         <w:t xml:space="preserve">Structure in </w:t>
       </w:r>
       <w:r>
+        <w:rPr>
+          <w:lang w:val="fr-FR"/>
+        </w:rPr>
         <w:t>c</w:t>
       </w:r>
       <w:r>
+        <w:rPr>
+          <w:lang w:val="fr-FR"/>
+        </w:rPr>
         <w:t>onversation</w:t>
       </w:r>
       <w:r>
+        <w:rPr>
+          <w:lang w:val="fr-FR"/>
+        </w:rPr>
         <w:t>"</w:t>
       </w:r>
       <w:r>
+        <w:rPr>
+          <w:lang w:val="fr-FR"/>
+        </w:rPr>
         <w:t xml:space="preserve">. </w:t>
       </w:r>
       <w:r>
@@ -1506,6 +1510,7 @@
   <w:style w:type="character" w:default="1" w:styleId="Policepardfaut">
     <w:name w:val="Default Paragraph Font"/>
     <w:uiPriority w:val="1"/>
+    <w:semiHidden/>
     <w:unhideWhenUsed/>
   </w:style>
   <w:style w:type="table" w:default="1" w:styleId="TableauNormal">

</xml_diff>

<commit_message>
Added phone to CV
</commit_message>
<xml_diff>
--- a/cv/erez-volk-cv-programmer.docx
+++ b/cv/erez-volk-cv-programmer.docx
@@ -46,6 +46,14 @@
     </w:p>
     <w:p>
       <w:pPr>
+        <w:pStyle w:val="CVEmail"/>
+      </w:pPr>
+      <w:r>
+        <w:t>+33 (0)6 85 95 29 62</w:t>
+      </w:r>
+    </w:p>
+    <w:p>
+      <w:pPr>
         <w:pStyle w:val="CVHomepage"/>
       </w:pPr>
       <w:r>
@@ -391,9 +399,15 @@
         <w:tab/>
       </w:r>
       <w:r>
-        <w:t>Developer@</w:t>
-      </w:r>
-      <w:r>
+        <w:t>Developer</w:t>
+      </w:r>
+      <w:r>
+        <w:t xml:space="preserve">, </w:t>
+      </w:r>
+      <w:r>
+        <w:rPr>
+          <w:rStyle w:val="CVEmployer"/>
+        </w:rPr>
         <w:t>Government of Israel</w:t>
       </w:r>
     </w:p>
@@ -446,9 +460,15 @@
         <w:tab/>
       </w:r>
       <w:r>
-        <w:t>Developer@</w:t>
-      </w:r>
-      <w:r>
+        <w:t>Developer</w:t>
+      </w:r>
+      <w:r>
+        <w:t xml:space="preserve">, </w:t>
+      </w:r>
+      <w:r>
+        <w:rPr>
+          <w:rStyle w:val="CVEmployer"/>
+        </w:rPr>
         <w:t>RepliWeb</w:t>
       </w:r>
     </w:p>
@@ -489,7 +509,34 @@
         <w:t>at</w:t>
       </w:r>
       <w:r>
-        <w:t xml:space="preserve"> Tel Aviv, Bar-Ilan, and Ben Gurion </w:t>
+        <w:t xml:space="preserve"> </w:t>
+      </w:r>
+      <w:r>
+        <w:rPr>
+          <w:rStyle w:val="CVEmployer"/>
+        </w:rPr>
+        <w:t>Tel Aviv</w:t>
+      </w:r>
+      <w:r>
+        <w:t xml:space="preserve">, </w:t>
+      </w:r>
+      <w:r>
+        <w:rPr>
+          <w:rStyle w:val="CVEmployer"/>
+        </w:rPr>
+        <w:t>Bar-Ilan</w:t>
+      </w:r>
+      <w:r>
+        <w:t xml:space="preserve">, and </w:t>
+      </w:r>
+      <w:r>
+        <w:rPr>
+          <w:rStyle w:val="CVEmployer"/>
+        </w:rPr>
+        <w:t>Ben Gurion</w:t>
+      </w:r>
+      <w:r>
+        <w:t xml:space="preserve"> </w:t>
       </w:r>
       <w:r>
         <w:t>u</w:t>
@@ -509,15 +556,22 @@
         <w:pStyle w:val="CVEmployment"/>
       </w:pPr>
       <w:r>
+        <w:lastRenderedPageBreak/>
         <w:t>2012-2015</w:t>
       </w:r>
       <w:r>
         <w:tab/>
       </w:r>
       <w:r>
-        <w:t>Developer@</w:t>
-      </w:r>
-      <w:r>
+        <w:t>Developer</w:t>
+      </w:r>
+      <w:r>
+        <w:t xml:space="preserve">, </w:t>
+      </w:r>
+      <w:r>
+        <w:rPr>
+          <w:rStyle w:val="CVEmployer"/>
+        </w:rPr>
         <w:t>ConteXtream</w:t>
       </w:r>
     </w:p>
@@ -529,7 +583,6 @@
         <w:rPr>
           <w:rStyle w:val="CVProgrammingLanguage"/>
         </w:rPr>
-        <w:lastRenderedPageBreak/>
         <w:t>[C</w:t>
       </w:r>
       <w:r>
@@ -565,9 +618,15 @@
         <w:tab/>
       </w:r>
       <w:r>
-        <w:t>Developer@</w:t>
-      </w:r>
-      <w:r>
+        <w:t>Developer</w:t>
+      </w:r>
+      <w:r>
+        <w:t xml:space="preserve">, </w:t>
+      </w:r>
+      <w:r>
+        <w:rPr>
+          <w:rStyle w:val="CVEmployer"/>
+        </w:rPr>
         <w:t>Chorus.ai</w:t>
       </w:r>
     </w:p>
@@ -605,9 +664,15 @@
         <w:tab/>
       </w:r>
       <w:r>
-        <w:t>Research Assistant@</w:t>
-      </w:r>
-      <w:r>
+        <w:t>Research Assistant</w:t>
+      </w:r>
+      <w:r>
+        <w:t xml:space="preserve">, </w:t>
+      </w:r>
+      <w:r>
+        <w:rPr>
+          <w:rStyle w:val="CVEmployer"/>
+        </w:rPr>
         <w:t>Weizmann Institute</w:t>
       </w:r>
     </w:p>
@@ -728,9 +793,15 @@
         <w:tab/>
       </w:r>
       <w:r>
-        <w:t>Researcher@</w:t>
-      </w:r>
-      <w:r>
+        <w:t>Researcher</w:t>
+      </w:r>
+      <w:r>
+        <w:t xml:space="preserve">, </w:t>
+      </w:r>
+      <w:r>
+        <w:rPr>
+          <w:rStyle w:val="CVEmployer"/>
+        </w:rPr>
         <w:t>NeuraLight</w:t>
       </w:r>
     </w:p>
@@ -759,9 +830,15 @@
         <w:tab/>
       </w:r>
       <w:r>
-        <w:t>Architect@</w:t>
-      </w:r>
-      <w:r>
+        <w:t>Architect</w:t>
+      </w:r>
+      <w:r>
+        <w:t xml:space="preserve">, </w:t>
+      </w:r>
+      <w:r>
+        <w:rPr>
+          <w:rStyle w:val="CVEmployer"/>
+        </w:rPr>
         <w:t>HPE</w:t>
       </w:r>
     </w:p>
@@ -841,34 +918,10 @@
         <w:pStyle w:val="CVText"/>
       </w:pPr>
       <w:r>
-        <w:t xml:space="preserve">Translated over 60 books from English, French, German, Portuguese, and Spanish into Hebrew, including </w:t>
-      </w:r>
-      <w:r>
-        <w:rPr>
-          <w:rStyle w:val="CVItalic"/>
-        </w:rPr>
-        <w:t>The Book of Why</w:t>
-      </w:r>
-      <w:r>
-        <w:t xml:space="preserve"> by Judea Pearl, </w:t>
-      </w:r>
-      <w:r>
-        <w:rPr>
-          <w:rStyle w:val="CVItalic"/>
-        </w:rPr>
-        <w:t>Nineteen Eighty-Four</w:t>
-      </w:r>
-      <w:r>
-        <w:t xml:space="preserve"> by George Orwell, and </w:t>
-      </w:r>
-      <w:r>
-        <w:rPr>
-          <w:rStyle w:val="CVItalic"/>
-        </w:rPr>
-        <w:t>Notre-Dame de Paris [The Hunchback of Notre-Dame]</w:t>
-      </w:r>
-      <w:r>
-        <w:t xml:space="preserve"> by Victor Hugo.</w:t>
+        <w:t>Since 2009, t</w:t>
+      </w:r>
+      <w:r>
+        <w:t>ranslated over 60 books from English, French, German, Portuguese, and Spanish into Hebrew.</w:t>
       </w:r>
     </w:p>
     <w:sectPr>
@@ -1994,6 +2047,15 @@
     <w:qFormat/>
     <w:rsid w:val="007635E4"/>
   </w:style>
+  <w:style w:type="character" w:customStyle="1" w:styleId="CVEmployer">
+    <w:name w:val="CV Employer"/>
+    <w:basedOn w:val="Policepardfaut"/>
+    <w:uiPriority w:val="1"/>
+    <w:rsid w:val="00BE0034"/>
+    <w:rPr>
+      <w:color w:val="70AD47" w:themeColor="accent6"/>
+    </w:rPr>
+  </w:style>
 </w:styles>
 </file>
 

</xml_diff>

<commit_message>
cv: Another phone number
</commit_message>
<xml_diff>
--- a/cv/erez-volk-cv-programmer.docx
+++ b/cv/erez-volk-cv-programmer.docx
@@ -41,14 +41,13 @@
         <w:pStyle w:val="CVEmail"/>
       </w:pPr>
       <w:r>
-        <w:t>erez.volk</w:t>
-      </w:r>
-      <w:r>
-        <w:rPr>
-          <w:rStyle w:val="CVAtSymbol"/>
-          <w:rFonts w:hint="cs"/>
-        </w:rPr>
-        <w:t>＠</w:t>
+        <w:t>erez.</w:t>
+      </w:r>
+      <w:r>
+        <w:t>volk</w:t>
+      </w:r>
+      <w:r>
+        <w:t xml:space="preserve"> at </w:t>
       </w:r>
       <w:r>
         <w:t>gmail.com</w:t>
@@ -81,6 +80,9 @@
       <w:r>
         <w:t>6 85 95 29 62</w:t>
       </w:r>
+      <w:r>
+        <w:t xml:space="preserve"> / +972 54 5590031</w:t>
+      </w:r>
     </w:p>
     <w:p>
       <w:pPr>
@@ -533,60 +535,60 @@
         <w:pStyle w:val="CVJobDescription"/>
       </w:pPr>
       <w:r>
+        <w:t xml:space="preserve">Taught phonetics, phonology, and field methods </w:t>
+      </w:r>
+      <w:r>
+        <w:t>at</w:t>
+      </w:r>
+      <w:r>
+        <w:t xml:space="preserve"> </w:t>
+      </w:r>
+      <w:r>
+        <w:rPr>
+          <w:rStyle w:val="CVEmployer"/>
+        </w:rPr>
+        <w:t>Tel Aviv</w:t>
+      </w:r>
+      <w:r>
+        <w:t xml:space="preserve">, </w:t>
+      </w:r>
+      <w:r>
+        <w:rPr>
+          <w:rStyle w:val="CVEmployer"/>
+        </w:rPr>
+        <w:t>Bar-Ilan</w:t>
+      </w:r>
+      <w:r>
+        <w:t xml:space="preserve">, and </w:t>
+      </w:r>
+      <w:r>
+        <w:rPr>
+          <w:rStyle w:val="CVEmployer"/>
+        </w:rPr>
+        <w:t>Ben Gurion</w:t>
+      </w:r>
+      <w:r>
+        <w:t xml:space="preserve"> </w:t>
+      </w:r>
+      <w:r>
+        <w:t>u</w:t>
+      </w:r>
+      <w:r>
+        <w:t>niversit</w:t>
+      </w:r>
+      <w:r>
+        <w:t>ies</w:t>
+      </w:r>
+      <w:r>
+        <w:t>.</w:t>
+      </w:r>
+    </w:p>
+    <w:p>
+      <w:pPr>
+        <w:pStyle w:val="CVEmployment"/>
+      </w:pPr>
+      <w:r>
         <w:lastRenderedPageBreak/>
-        <w:t xml:space="preserve">Taught phonetics, phonology, and field methods </w:t>
-      </w:r>
-      <w:r>
-        <w:t>at</w:t>
-      </w:r>
-      <w:r>
-        <w:t xml:space="preserve"> </w:t>
-      </w:r>
-      <w:r>
-        <w:rPr>
-          <w:rStyle w:val="CVEmployer"/>
-        </w:rPr>
-        <w:t>Tel Aviv</w:t>
-      </w:r>
-      <w:r>
-        <w:t xml:space="preserve">, </w:t>
-      </w:r>
-      <w:r>
-        <w:rPr>
-          <w:rStyle w:val="CVEmployer"/>
-        </w:rPr>
-        <w:t>Bar-Ilan</w:t>
-      </w:r>
-      <w:r>
-        <w:t xml:space="preserve">, and </w:t>
-      </w:r>
-      <w:r>
-        <w:rPr>
-          <w:rStyle w:val="CVEmployer"/>
-        </w:rPr>
-        <w:t>Ben Gurion</w:t>
-      </w:r>
-      <w:r>
-        <w:t xml:space="preserve"> </w:t>
-      </w:r>
-      <w:r>
-        <w:t>u</w:t>
-      </w:r>
-      <w:r>
-        <w:t>niversit</w:t>
-      </w:r>
-      <w:r>
-        <w:t>ies</w:t>
-      </w:r>
-      <w:r>
-        <w:t>.</w:t>
-      </w:r>
-    </w:p>
-    <w:p>
-      <w:pPr>
-        <w:pStyle w:val="CVEmployment"/>
-      </w:pPr>
-      <w:r>
         <w:t>2012-2015</w:t>
       </w:r>
       <w:r>
@@ -1593,6 +1595,7 @@
   <w:style w:type="character" w:default="1" w:styleId="Policepardfaut">
     <w:name w:val="Default Paragraph Font"/>
     <w:uiPriority w:val="1"/>
+    <w:semiHidden/>
     <w:unhideWhenUsed/>
   </w:style>
   <w:style w:type="table" w:default="1" w:styleId="TableauNormal">

</xml_diff>

<commit_message>
cv: Updated programmer CV
</commit_message>
<xml_diff>
--- a/cv/erez-volk-cv-programmer.docx
+++ b/cv/erez-volk-cv-programmer.docx
@@ -257,12 +257,14 @@
       <w:r>
         <w:t xml:space="preserve">, </w:t>
       </w:r>
+      <w:proofErr w:type="spellStart"/>
       <w:r>
         <w:rPr>
           <w:rStyle w:val="CVProgrammingLanguage"/>
         </w:rPr>
         <w:t>sh</w:t>
       </w:r>
+      <w:proofErr w:type="spellEnd"/>
       <w:r>
         <w:t> </w:t>
       </w:r>
@@ -301,12 +303,14 @@
       <w:r>
         <w:t xml:space="preserve">, </w:t>
       </w:r>
+      <w:proofErr w:type="gramStart"/>
       <w:r>
         <w:rPr>
           <w:rStyle w:val="CVProgrammingLanguage"/>
         </w:rPr>
         <w:t>Go</w:t>
       </w:r>
+      <w:proofErr w:type="gramEnd"/>
       <w:r>
         <w:t> </w:t>
       </w:r>
@@ -497,12 +501,14 @@
       <w:r>
         <w:t xml:space="preserve">, </w:t>
       </w:r>
+      <w:proofErr w:type="spellStart"/>
       <w:r>
         <w:rPr>
           <w:rStyle w:val="CVEmployer"/>
         </w:rPr>
         <w:t>RepliWeb</w:t>
       </w:r>
+      <w:proofErr w:type="spellEnd"/>
     </w:p>
     <w:p>
       <w:pPr>
@@ -600,12 +606,14 @@
       <w:r>
         <w:t xml:space="preserve">, </w:t>
       </w:r>
+      <w:proofErr w:type="spellStart"/>
       <w:r>
         <w:rPr>
           <w:rStyle w:val="CVEmployer"/>
         </w:rPr>
         <w:t>ConteXtream</w:t>
       </w:r>
+      <w:proofErr w:type="spellEnd"/>
     </w:p>
     <w:p>
       <w:pPr>
@@ -744,6 +752,7 @@
       <w:r>
         <w:tab/>
       </w:r>
+      <w:proofErr w:type="spellStart"/>
       <w:r>
         <w:rPr>
           <w:lang w:val="fr-FR"/>
@@ -760,12 +769,19 @@
         <w:rPr>
           <w:lang w:val="fr-FR"/>
         </w:rPr>
-        <w:t xml:space="preserve">on et al. (2025), </w:t>
-      </w:r>
+        <w:t>on</w:t>
+      </w:r>
+      <w:proofErr w:type="spellEnd"/>
       <w:r>
         <w:rPr>
           <w:lang w:val="fr-FR"/>
         </w:rPr>
+        <w:t xml:space="preserve"> et al. (2025), </w:t>
+      </w:r>
+      <w:r>
+        <w:rPr>
+          <w:lang w:val="fr-FR"/>
+        </w:rPr>
         <w:t>"</w:t>
       </w:r>
       <w:r>
@@ -830,12 +846,14 @@
       <w:r>
         <w:t xml:space="preserve">, </w:t>
       </w:r>
+      <w:proofErr w:type="spellStart"/>
       <w:r>
         <w:rPr>
           <w:rStyle w:val="CVEmployer"/>
         </w:rPr>
         <w:t>NeuraLight</w:t>
       </w:r>
+      <w:proofErr w:type="spellEnd"/>
     </w:p>
     <w:p>
       <w:pPr>
@@ -899,10 +917,68 @@
     </w:p>
     <w:p>
       <w:pPr>
+        <w:pStyle w:val="CVEmployment"/>
+      </w:pPr>
+      <w:r>
+        <w:t>2026</w:t>
+      </w:r>
+      <w:r>
+        <w:t>-</w:t>
+      </w:r>
+      <w:r>
+        <w:tab/>
+      </w:r>
+      <w:r>
+        <w:t>Developer</w:t>
+      </w:r>
+      <w:r>
+        <w:t xml:space="preserve">, </w:t>
+      </w:r>
+      <w:r>
+        <w:rPr>
+          <w:rStyle w:val="CVEmployer"/>
+        </w:rPr>
+        <w:t>Hexight.io</w:t>
+      </w:r>
+    </w:p>
+    <w:p>
+      <w:pPr>
+        <w:pStyle w:val="CVJobDescription"/>
+      </w:pPr>
+      <w:r>
+        <w:rPr>
+          <w:rStyle w:val="CVProgrammingLanguage"/>
+        </w:rPr>
+        <w:t>[</w:t>
+      </w:r>
+      <w:r>
+        <w:rPr>
+          <w:rStyle w:val="CVProgrammingLanguage"/>
+        </w:rPr>
+        <w:t>Python</w:t>
+      </w:r>
+      <w:r>
+        <w:rPr>
+          <w:rStyle w:val="CVProgrammingLanguage"/>
+        </w:rPr>
+        <w:t>]</w:t>
+      </w:r>
+      <w:r>
+        <w:t xml:space="preserve"> </w:t>
+      </w:r>
+      <w:r>
+        <w:t>Supply chain planning</w:t>
+      </w:r>
+      <w:r>
+        <w:t>.</w:t>
+      </w:r>
+    </w:p>
+    <w:p>
+      <w:pPr>
         <w:pStyle w:val="CVSection"/>
       </w:pPr>
       <w:r>
-        <w:t>Open Source</w:t>
+        <w:t>Open-Source</w:t>
       </w:r>
       <w:r>
         <w:t xml:space="preserve"> Software</w:t>
@@ -915,12 +991,14 @@
       <w:r>
         <w:t xml:space="preserve">Original author of </w:t>
       </w:r>
+      <w:proofErr w:type="spellStart"/>
       <w:r>
         <w:rPr>
           <w:rStyle w:val="CVProgrammingLanguage"/>
         </w:rPr>
         <w:t>CxxTest</w:t>
       </w:r>
+      <w:proofErr w:type="spellEnd"/>
       <w:r>
         <w:t xml:space="preserve">, a unit testing framework for </w:t>
       </w:r>

</xml_diff>